<commit_message>
Module 3 v2: the counting-side twin of the independence test
Section 7 operationalised the independence test for ARGUMENTS. The same
failure occurs when counting EVIDENCE, and there it has a one-line test:

  Is this a new LOOK at the world, or a second STORY about the same look?
  Only the first goes in the tally.

Independent observations add weight. Independent mechanisms explaining one
observation add robustness, not weight - the conclusion survives if one
explanation is wrong, but nothing has been seen twice. Robustness and
weight are different quantities and a narrative runs them together.

Recorded with its provenance: the author committed exactly this error
while arguing an unrelated point, described one bad outcome through two
failure mechanisms, and reported it as two findings.

Co-Authored-By: Claude Opus 5 (1M context) <noreply@anthropic.com>
Claude-Session: https://claude.ai/code/session_01PfEdt2X3ayB4TeJ7gNfzUn
</commit_message>
<xml_diff>
--- a/String Mathematics/Syllabus-Learning/module-3/String-Mathematics-Module-3-Tuned-Comparisons.docx
+++ b/String Mathematics/Syllabus-Learning/module-3/String-Mathematics-Module-3-Tuned-Comparisons.docx
@@ -187,7 +187,7 @@
         <w:t xml:space="preserve"> </w:t>
       </w:r>
       <w:r>
-        <w:t xml:space="preserve">1</w:t>
+        <w:t xml:space="preserve">2</w:t>
       </w:r>
     </w:p>
     <w:sdt>
@@ -243,7 +243,7 @@
           <w:bCs/>
           <w:b/>
         </w:rPr>
-        <w:t xml:space="preserve">Version 1.</w:t>
+        <w:t xml:space="preserve">Version 2.</w:t>
       </w:r>
       <w:r>
         <w:t xml:space="preserve"> </w:t>
@@ -8624,7 +8624,7 @@
     </w:p>
     <w:bookmarkEnd w:id="57"/>
     <w:bookmarkEnd w:id="58"/>
-    <w:bookmarkStart w:id="59" w:name="Xb9d0db73918425f657b10df6b493f496bc1d3ed"/>
+    <w:bookmarkStart w:id="62" w:name="Xb9d0db73918425f657b10df6b493f496bc1d3ed"/>
     <w:p>
       <w:pPr>
         <w:pStyle w:val="Heading1"/>
@@ -8993,9 +8993,253 @@
         <w:t xml:space="preserve">Three lists identical, one disjoint. Honest count: two independent arguments, not four.</w:t>
       </w:r>
     </w:p>
+    <w:bookmarkStart w:id="60" w:name="Xe7ce92c4ffdbe43bd81c0ee479bba345390d281"/>
+    <w:p>
+      <w:pPr>
+        <w:pStyle w:val="Heading2"/>
+      </w:pPr>
+      <w:r>
+        <w:t xml:space="preserve">7.1 The same problem when counting evidence, not proofs</w:t>
+      </w:r>
+    </w:p>
+    <w:p>
+      <w:pPr>
+        <w:pStyle w:val="FirstParagraph"/>
+      </w:pPr>
+      <w:r>
+        <w:t xml:space="preserve">The procedure above compares</w:t>
+      </w:r>
+      <w:r>
+        <w:t xml:space="preserve"> </w:t>
+      </w:r>
+      <w:r>
+        <w:rPr>
+          <w:iCs/>
+          <w:i/>
+        </w:rPr>
+        <w:t xml:space="preserve">arguments</w:t>
+      </w:r>
+      <w:r>
+        <w:t xml:space="preserve">. The identical failure occurs when counting</w:t>
+      </w:r>
+      <w:r>
+        <w:t xml:space="preserve"> </w:t>
+      </w:r>
+      <w:r>
+        <w:rPr>
+          <w:iCs/>
+          <w:i/>
+        </w:rPr>
+        <w:t xml:space="preserve">evidence</w:t>
+      </w:r>
+      <w:r>
+        <w:t xml:space="preserve">, and there it has a one-line test.</w:t>
+      </w:r>
+    </w:p>
     <w:p>
       <w:pPr>
         <w:pStyle w:val="BodyText"/>
+      </w:pPr>
+      <w:r>
+        <w:t xml:space="preserve">Suppose several independent mechanisms all point at one conclusion.</w:t>
+      </w:r>
+      <w:r>
+        <w:t xml:space="preserve"> </w:t>
+      </w:r>
+      <w:r>
+        <w:rPr>
+          <w:bCs/>
+          <w:b/>
+        </w:rPr>
+        <w:t xml:space="preserve">It is tempting to count them as several pieces of evidence. Usually they are one.</w:t>
+      </w:r>
+    </w:p>
+    <w:p>
+      <w:pPr>
+        <w:pStyle w:val="Heading3"/>
+      </w:pPr>
+      <w:bookmarkStart w:id="59" w:name="test-before-counting"/>
+      <w:r>
+        <w:t xml:space="preserve">Test before counting</w:t>
+      </w:r>
+      <w:bookmarkEnd w:id="59"/>
+    </w:p>
+    <w:p>
+      <w:pPr>
+        <w:pStyle w:val="BlockText"/>
+      </w:pPr>
+      <w:r>
+        <w:rPr>
+          <w:bCs/>
+          <w:b/>
+        </w:rPr>
+        <w:t xml:space="preserve">Is this a new</w:t>
+      </w:r>
+      <w:r>
+        <w:rPr>
+          <w:bCs/>
+          <w:b/>
+        </w:rPr>
+        <w:t xml:space="preserve"> </w:t>
+      </w:r>
+      <w:r>
+        <w:rPr>
+          <w:iCs/>
+          <w:i/>
+          <w:bCs/>
+          <w:b/>
+        </w:rPr>
+        <w:t xml:space="preserve">look</w:t>
+      </w:r>
+      <w:r>
+        <w:rPr>
+          <w:bCs/>
+          <w:b/>
+        </w:rPr>
+        <w:t xml:space="preserve"> </w:t>
+      </w:r>
+      <w:r>
+        <w:rPr>
+          <w:bCs/>
+          <w:b/>
+        </w:rPr>
+        <w:t xml:space="preserve">at the world, or a second</w:t>
+      </w:r>
+      <w:r>
+        <w:rPr>
+          <w:bCs/>
+          <w:b/>
+        </w:rPr>
+        <w:t xml:space="preserve"> </w:t>
+      </w:r>
+      <w:r>
+        <w:rPr>
+          <w:iCs/>
+          <w:i/>
+          <w:bCs/>
+          <w:b/>
+        </w:rPr>
+        <w:t xml:space="preserve">story</w:t>
+      </w:r>
+      <w:r>
+        <w:rPr>
+          <w:bCs/>
+          <w:b/>
+        </w:rPr>
+        <w:t xml:space="preserve"> </w:t>
+      </w:r>
+      <w:r>
+        <w:rPr>
+          <w:bCs/>
+          <w:b/>
+        </w:rPr>
+        <w:t xml:space="preserve">about the same look?</w:t>
+      </w:r>
+      <w:r>
+        <w:t xml:space="preserve"> </w:t>
+      </w:r>
+      <w:r>
+        <w:rPr>
+          <w:bCs/>
+          <w:b/>
+        </w:rPr>
+        <w:t xml:space="preserve">Only the first goes in the tally.</w:t>
+      </w:r>
+    </w:p>
+    <w:p>
+      <w:pPr>
+        <w:numPr>
+          <w:ilvl w:val="0"/>
+          <w:numId w:val="1006"/>
+        </w:numPr>
+        <w:pStyle w:val="Compact"/>
+      </w:pPr>
+      <w:r>
+        <w:rPr>
+          <w:bCs/>
+          <w:b/>
+        </w:rPr>
+        <w:t xml:space="preserve">Independent observations add weight.</w:t>
+      </w:r>
+      <w:r>
+        <w:t xml:space="preserve"> </w:t>
+      </w:r>
+      <w:r>
+        <w:t xml:space="preserve">Two people running two different tests on the same object have genuinely looked twice.</w:t>
+      </w:r>
+    </w:p>
+    <w:p>
+      <w:pPr>
+        <w:numPr>
+          <w:ilvl w:val="0"/>
+          <w:numId w:val="1006"/>
+        </w:numPr>
+        <w:pStyle w:val="Compact"/>
+      </w:pPr>
+      <w:r>
+        <w:rPr>
+          <w:bCs/>
+          <w:b/>
+        </w:rPr>
+        <w:t xml:space="preserve">Independent mechanisms explaining one observation add robustness, not weight.</w:t>
+      </w:r>
+      <w:r>
+        <w:t xml:space="preserve"> </w:t>
+      </w:r>
+      <w:r>
+        <w:t xml:space="preserve">The conclusion survives if one explanation is wrong — which is worth something — but</w:t>
+      </w:r>
+      <w:r>
+        <w:t xml:space="preserve"> </w:t>
+      </w:r>
+      <w:r>
+        <w:rPr>
+          <w:bCs/>
+          <w:b/>
+        </w:rPr>
+        <w:t xml:space="preserve">you have not seen anything twice.</w:t>
+      </w:r>
+    </w:p>
+    <w:p>
+      <w:pPr>
+        <w:pStyle w:val="FirstParagraph"/>
+      </w:pPr>
+      <w:r>
+        <w:rPr>
+          <w:bCs/>
+          <w:b/>
+        </w:rPr>
+        <w:t xml:space="preserve">Robustness and weight are different quantities, and a narrative runs them together</w:t>
+      </w:r>
+      <w:r>
+        <w:t xml:space="preserve">: describing one event through two mechanisms makes it feel like two events. The test above is what separates them, and it can be applied in the moment rather than reconstructed afterwards.</w:t>
+      </w:r>
+    </w:p>
+    <w:p>
+      <w:pPr>
+        <w:pStyle w:val="BodyText"/>
+      </w:pPr>
+      <w:r>
+        <w:rPr>
+          <w:iCs/>
+          <w:i/>
+        </w:rPr>
+        <w:t xml:space="preserve">This section exists because the author of this syllabus committed exactly that error while arguing an unrelated point, described a single bad outcome through two different failure mechanisms, and reported the result as if it were two findings.</w:t>
+      </w:r>
+    </w:p>
+    <w:bookmarkEnd w:id="60"/>
+    <w:bookmarkStart w:id="61" w:name="a-note-on-the-two-halves"/>
+    <w:p>
+      <w:pPr>
+        <w:pStyle w:val="Heading2"/>
+      </w:pPr>
+      <w:r>
+        <w:t xml:space="preserve">7.2 A note on the two halves</w:t>
+      </w:r>
+    </w:p>
+    <w:p>
+      <w:pPr>
+        <w:pStyle w:val="FirstParagraph"/>
       </w:pPr>
       <w:r>
         <w:rPr>
@@ -9044,8 +9288,9 @@
         </w:pict>
       </w:r>
     </w:p>
-    <w:bookmarkEnd w:id="59"/>
-    <w:bookmarkStart w:id="62" w:name="exercises"/>
+    <w:bookmarkEnd w:id="61"/>
+    <w:bookmarkEnd w:id="62"/>
+    <w:bookmarkStart w:id="65" w:name="exercises"/>
     <w:p>
       <w:pPr>
         <w:pStyle w:val="Heading1"/>
@@ -9054,7 +9299,7 @@
         <w:t xml:space="preserve">8. Exercises</w:t>
       </w:r>
     </w:p>
-    <w:bookmarkStart w:id="60" w:name="problems"/>
+    <w:bookmarkStart w:id="63" w:name="problems"/>
     <w:p>
       <w:pPr>
         <w:pStyle w:val="Heading2"/>
@@ -9660,8 +9905,8 @@
         <w:t xml:space="preserve">produce a rule with no irrational numbers in it, when both tunings are irrational?</w:t>
       </w:r>
     </w:p>
-    <w:bookmarkEnd w:id="60"/>
-    <w:bookmarkStart w:id="61" w:name="answers"/>
+    <w:bookmarkEnd w:id="63"/>
+    <w:bookmarkStart w:id="64" w:name="answers"/>
     <w:p>
       <w:pPr>
         <w:pStyle w:val="Heading2"/>
@@ -10771,9 +11016,9 @@
         </w:pict>
       </w:r>
     </w:p>
-    <w:bookmarkEnd w:id="61"/>
-    <w:bookmarkEnd w:id="62"/>
-    <w:bookmarkStart w:id="63" w:name="glossary-notation-and-status"/>
+    <w:bookmarkEnd w:id="64"/>
+    <w:bookmarkEnd w:id="65"/>
+    <w:bookmarkStart w:id="66" w:name="glossary-notation-and-status"/>
     <w:p>
       <w:pPr>
         <w:pStyle w:val="Heading1"/>
@@ -11798,8 +12043,8 @@
         </w:pict>
       </w:r>
     </w:p>
-    <w:bookmarkEnd w:id="63"/>
-    <w:bookmarkStart w:id="64" w:name="looking-ahead"/>
+    <w:bookmarkEnd w:id="66"/>
+    <w:bookmarkStart w:id="67" w:name="looking-ahead"/>
     <w:p>
       <w:pPr>
         <w:pStyle w:val="Heading1"/>
@@ -11973,10 +12218,10 @@
           <w:iCs/>
           <w:i/>
         </w:rPr>
-        <w:t xml:space="preserve">End of Module 3, Version 1.</w:t>
-      </w:r>
-    </w:p>
-    <w:bookmarkEnd w:id="64"/>
+        <w:t xml:space="preserve">End of Module 3, Version 2.</w:t>
+      </w:r>
+    </w:p>
+    <w:bookmarkEnd w:id="67"/>
     <w:sectPr/>
   </w:body>
 </w:document>
@@ -12315,6 +12560,9 @@
     <w:lvlOverride w:ilvl="8">
       <w:startOverride w:val="1"/>
     </w:lvlOverride>
+  </w:num>
+  <w:num w:numId="1006">
+    <w:abstractNumId w:val="991"/>
   </w:num>
 </w:numbering>
 </file>

</xml_diff>